<commit_message>
Stjernekort: opdater DVR-testdata med Udbudsbetingelser + rettede kilder
Tilføjer Udbudsbetingelser + Tilbudsbrev + Bilag A/B til DVR-testdata,
svarende til ESDH-strukturen. Bilag 5 og Bilag 12 er opdateret med rigtige
rettelser fra det virkelige materiale: Bilag 5 citerer nu korrekt
"Kontraktens punkt 23.2" (var 24.2), og Bilag 12 citerer nu korrekt "bilag
5, punkt 7.4" (var 8.4) - begge de tidligere kendte DVR-fejl er dermed
rettet ved kilden, jf. tests/test_dvr.py::test_ingen_brudte_henvisninger.

De to samlede QA-notater er fjernet, da testdata/dvr-mappen i mellemtiden
er blevet erstattet med et nyt, komplet sæt (og de tilhørende filer derfor
ikke længere findes).

Co-Authored-By: Claude Sonnet 5 <noreply@anthropic.com>
</commit_message>
<xml_diff>
--- a/Stjernekort/testdata/dvr/23. Bilag 12_Leverancevederlag og betalingsplan samt øvrige priser.docx
+++ b/Stjernekort/testdata/dvr/23. Bilag 12_Leverancevederlag og betalingsplan samt øvrige priser.docx
@@ -4781,36 +4781,55 @@
     </w:p>
     <w:p>
       <w:r>
+        <w:rPr/>
         <w:t xml:space="preserve">Hvis Kunden foretager særskilt bestilling af vedligeholdelsesarbejder, herunder fejlafhjælpning, </w:t>
       </w:r>
       <w:r>
-        <w:t>jf. bilag 5, punkt 8.4,</w:t>
-      </w:r>
-      <w:r>
+        <w:rPr/>
+        <w:t xml:space="preserve">jf. bilag 5, punkt </w:t>
+      </w:r>
+      <w:r>
+        <w:rPr/>
+        <w:t>7</w:t>
+      </w:r>
+      <w:r>
+        <w:rPr/>
+        <w:t>.4,</w:t>
+      </w:r>
+      <w:r>
+        <w:rPr/>
         <w:t xml:space="preserve"> eller i øvrigt har pålagt Leverandøren at udføre ydelser </w:t>
       </w:r>
       <w:r>
+        <w:rPr/>
         <w:t>uden for normal arbejdstid</w:t>
       </w:r>
       <w:r>
+        <w:rPr/>
         <w:t xml:space="preserve"> (7.00 til 18.00 på Arbejdsdage)</w:t>
       </w:r>
       <w:r>
+        <w:rPr/>
         <w:t xml:space="preserve">, opgøres vederlaget på baggrund af </w:t>
       </w:r>
       <w:r>
+        <w:rPr/>
         <w:t>f</w:t>
       </w:r>
       <w:r>
+        <w:rPr/>
         <w:t xml:space="preserve">ølgende tillæg til de gældende </w:t>
       </w:r>
       <w:r>
+        <w:rPr/>
         <w:t>timepris</w:t>
       </w:r>
       <w:r>
+        <w:rPr/>
         <w:t>er, jf. punkt</w:t>
       </w:r>
       <w:r>
+        <w:rPr/>
         <w:t xml:space="preserve"> </w:t>
       </w:r>
       <w:r>
@@ -4823,12 +4842,14 @@
         <w:fldChar w:fldCharType="separate"/>
       </w:r>
       <w:r>
+        <w:rPr/>
         <w:t>5.4</w:t>
       </w:r>
       <w:r>
         <w:fldChar w:fldCharType="end"/>
       </w:r>
       <w:r>
+        <w:rPr/>
         <w:t>:</w:t>
       </w:r>
     </w:p>
@@ -40134,14 +40155,14 @@
 <file path=customXml/item3.xml><?xml version="1.0" encoding="utf-8"?>
 <p:properties xmlns:p="http://schemas.microsoft.com/office/2006/metadata/properties" xmlns:xsi="http://www.w3.org/2001/XMLSchema-instance" xmlns:pc="http://schemas.microsoft.com/office/infopath/2007/PartnerControls">
   <documentManagement>
-    <Godkendtafkunden xmlns="2a4fc43e-74cb-4ecd-8f0b-7e4e11483b0c">Udestår</Godkendtafkunden>
+    <Godkendtafkunden xmlns="2a4fc43e-74cb-4ecd-8f0b-7e4e11483b0c">Klar til upload</Godkendtafkunden>
   </documentManagement>
 </p:properties>
 </file>
 
 <file path=customXml/item4.xml><?xml version="1.0" encoding="utf-8"?>
-<ct:contentTypeSchema xmlns:ct="http://schemas.microsoft.com/office/2006/metadata/contentType" xmlns:ma="http://schemas.microsoft.com/office/2006/metadata/properties/metaAttributes" ct:_="" ma:_="" ma:contentTypeName="Dokument" ma:contentTypeID="0x01010024373CE2A0AAA344A185260442135A2D" ma:contentTypeVersion="7" ma:contentTypeDescription="Opret et nyt dokument." ma:contentTypeScope="" ma:versionID="76ad4519aa1714fde3c96c2403e508d7">
-  <xsd:schema xmlns:xsd="http://www.w3.org/2001/XMLSchema" xmlns:xs="http://www.w3.org/2001/XMLSchema" xmlns:p="http://schemas.microsoft.com/office/2006/metadata/properties" xmlns:ns2="2a4fc43e-74cb-4ecd-8f0b-7e4e11483b0c" targetNamespace="http://schemas.microsoft.com/office/2006/metadata/properties" ma:root="true" ma:fieldsID="62d884777905cb7988e89b8e230839d6" ns2:_="">
+<ct:contentTypeSchema xmlns:ct="http://schemas.microsoft.com/office/2006/metadata/contentType" xmlns:ma="http://schemas.microsoft.com/office/2006/metadata/properties/metaAttributes" ct:_="" ma:_="" ma:contentTypeName="Document" ma:contentTypeID="0x01010024373CE2A0AAA344A185260442135A2D" ma:contentTypeVersion="7" ma:contentTypeDescription="Create a new document." ma:contentTypeScope="" ma:versionID="c352957fb64d73ea37153bc8851dd08b">
+  <xsd:schema xmlns:xsd="http://www.w3.org/2001/XMLSchema" xmlns:xs="http://www.w3.org/2001/XMLSchema" xmlns:p="http://schemas.microsoft.com/office/2006/metadata/properties" xmlns:ns2="2a4fc43e-74cb-4ecd-8f0b-7e4e11483b0c" targetNamespace="http://schemas.microsoft.com/office/2006/metadata/properties" ma:root="true" ma:fieldsID="cdc15103199d3093eb4a2dfc161609bd" ns2:_="">
     <xsd:import namespace="2a4fc43e-74cb-4ecd-8f0b-7e4e11483b0c"/>
     <xsd:element name="properties">
       <xsd:complexType>
@@ -40215,8 +40236,8 @@
         <xsd:element ref="dc:creator" minOccurs="0" maxOccurs="1"/>
         <xsd:element ref="dcterms:created" minOccurs="0" maxOccurs="1"/>
         <xsd:element ref="dc:identifier" minOccurs="0" maxOccurs="1"/>
-        <xsd:element name="contentType" minOccurs="0" maxOccurs="1" type="xsd:string" ma:index="0" ma:displayName="Indholdstype"/>
-        <xsd:element ref="dc:title" minOccurs="0" maxOccurs="1" ma:index="4" ma:displayName="Titel"/>
+        <xsd:element name="contentType" minOccurs="0" maxOccurs="1" type="xsd:string" ma:index="0" ma:displayName="Content Type"/>
+        <xsd:element ref="dc:title" minOccurs="0" maxOccurs="1" ma:index="4" ma:displayName="Title"/>
         <xsd:element ref="dc:subject" minOccurs="0" maxOccurs="1"/>
         <xsd:element ref="dc:description" minOccurs="0" maxOccurs="1"/>
         <xsd:element name="keywords" minOccurs="0" maxOccurs="1" type="xsd:string"/>
@@ -40332,5 +40353,5 @@
 </file>
 
 <file path=customXml/itemProps4.xml><?xml version="1.0" encoding="utf-8"?>
-<ds:datastoreItem xmlns:ds="http://schemas.openxmlformats.org/officeDocument/2006/customXml" ds:itemID="{46D37ED6-C610-43F2-A00B-2501F40BB816}"/>
+<ds:datastoreItem xmlns:ds="http://schemas.openxmlformats.org/officeDocument/2006/customXml" ds:itemID="{B1F00663-F612-4D87-A751-19B75DC5B1FB}"/>
 </file>
</xml_diff>